<commit_message>
docs: embed high-resolution 300 DPI architecture diagram and evaluation benchmark charts into DA3 implementation report
</commit_message>
<xml_diff>
--- a/Digital_Assignment3_Implementation_Report.docx
+++ b/Digital_Assignment3_Implementation_Report.docx
@@ -2355,73 +2355,54 @@
     </w:p>
     <w:p>
       <w:pPr>
-        <w:spacing w:before="80" w:after="120" w:line="252" w:lineRule="auto"/>
+        <w:keepNext/>
+        <w:spacing w:before="160" w:after="40"/>
+        <w:jc w:val="center"/>
       </w:pPr>
       <w:r>
-        <w:rPr>
-          <w:rFonts w:ascii="Consolas" w:hAnsi="Consolas"/>
-          <w:color w:val="0F172A"/>
-          <w:sz w:val="17"/>
-        </w:rPr>
-        <w:t>+------------------------------------------------------------------------------------------------------+</w:t>
-        <w:br/>
-        <w:t>|                                     PRESENTATION LAYER (Next.js 16)                                  |</w:t>
-        <w:br/>
-        <w:t>|  [Unified Knowledge Feed]  [PDF Viewer &amp; Chunks]  [Study Path Stepper]  [Interactive 2D Concept Graph] |</w:t>
-        <w:br/>
-        <w:t>+---------------------------------------------------+--------------------------------------------------+</w:t>
-        <w:br/>
-        <w:t xml:space="preserve">                                                    | RESTful JSON (HTTP / Port 8000)</w:t>
-        <w:br/>
-        <w:t>+---------------------------------------------------v--------------------------------------------------+</w:t>
-        <w:br/>
-        <w:t>|                                       API GATEWAY LAYER (FastAPI)                                    |</w:t>
-        <w:br/>
-        <w:t>|  - JWT Bearer &amp; PBKDF2 Auth        - 400-Word Sliding-Window Chunker     - Cycle-Safe Topological Sort|</w:t>
-        <w:br/>
-        <w:t>|  - Multi-Tenant Namespace Guard    - Gemini 2.5 Flash Extraction Engine  - Worker Lease Crash Recovery|</w:t>
-        <w:br/>
-        <w:t>+--------------------+----------------------+-----------------------+----------------------------------+</w:t>
-        <w:br/>
-        <w:t xml:space="preserve">                     |                      |                       |                                  </w:t>
-        <w:br/>
-        <w:t xml:space="preserve">        (Document Truth)      (Graph Traversal)       (Full-Text Index)       (Ephemeral State)        </w:t>
-        <w:br/>
-        <w:t xml:space="preserve">                     |                      |                       |                                  </w:t>
-        <w:br/>
-        <w:t>+--------------------v--+ +-----------------v---+ +-----------------v---+ +----------------------------v--+</w:t>
-        <w:br/>
-        <w:t>|       MONGODB         | |       NEO4J         | |   ELASTICSEARCH     | |           REDIS                |</w:t>
-        <w:br/>
-        <w:t>|     Port: 27017       | |   Port: 7687/7474   | |    Port: 9200       | |        Port: 6379              |</w:t>
-        <w:br/>
-        <w:t>| - users               | | Nodes:              | | Index:              | | Key Prefixes:                  |</w:t>
-        <w:br/>
-        <w:t>| - notes               | |  (:SP_Concept)      | |  studypath_notes    | |  sp:path:{u}:{c} (TTL 1800s)   |</w:t>
-        <w:br/>
-        <w:t>| - documents           | |  (:SP_Document)     | |  studypath_documents| |  sp:tb:gemini (Token Bucket)   |</w:t>
-        <w:br/>
-        <w:t>| - chunks (word bounds)| | Edges:              | | - BM25 Scoring      | |  sp:worker:lease (TTL 120s)    |</w:t>
-        <w:br/>
-        <w:t>| - user_known_concepts | |  [:PREREQUISITE_OF] | | - Fuzzy Typo Match  | |  user:{u}:recommendations      |</w:t>
-        <w:br/>
-        <w:t>| - knowledge_metrics   | |  [:MENTIONS]        | | - Trigram N-grams   | |  note:{id} (Entity Cache)      |</w:t>
-        <w:br/>
-        <w:t>+-----------------------+ +---------------------+ +---------------------+ +--------------------------------+</w:t>
-        <w:br/>
+        <w:drawing>
+          <wp:inline xmlns:a="http://schemas.openxmlformats.org/drawingml/2006/main" xmlns:pic="http://schemas.openxmlformats.org/drawingml/2006/picture">
+            <wp:extent cx="5943600" cy="3842327"/>
+            <wp:docPr id="1" name="Picture 1"/>
+            <wp:cNvGraphicFramePr>
+              <a:graphicFrameLocks noChangeAspect="1"/>
+            </wp:cNvGraphicFramePr>
+            <a:graphic>
+              <a:graphicData uri="http://schemas.openxmlformats.org/drawingml/2006/picture">
+                <pic:pic>
+                  <pic:nvPicPr>
+                    <pic:cNvPr id="0" name="fig1_system_architecture.png"/>
+                    <pic:cNvPicPr/>
+                  </pic:nvPicPr>
+                  <pic:blipFill>
+                    <a:blip r:embed="rId9"/>
+                    <a:stretch>
+                      <a:fillRect/>
+                    </a:stretch>
+                  </pic:blipFill>
+                  <pic:spPr>
+                    <a:xfrm>
+                      <a:off x="0" y="0"/>
+                      <a:ext cx="5943600" cy="3842327"/>
+                    </a:xfrm>
+                    <a:prstGeom prst="rect"/>
+                  </pic:spPr>
+                </pic:pic>
+              </a:graphicData>
+            </a:graphic>
+          </wp:inline>
+        </w:drawing>
       </w:r>
     </w:p>
     <w:p>
       <w:pPr>
-        <w:spacing w:before="0" w:after="160" w:line="276" w:lineRule="auto"/>
+        <w:spacing w:before="40" w:after="160"/>
         <w:jc w:val="center"/>
       </w:pPr>
       <w:r>
         <w:rPr>
           <w:rFonts w:ascii="Times New Roman" w:hAnsi="Times New Roman"/>
-          <w:b w:val="0"/>
           <w:i/>
-          <w:color w:val="000000"/>
           <w:sz w:val="17"/>
         </w:rPr>
         <w:t>Fig. 1: Polyglot Persistence Architecture of the Smart Notes+ Study Path Engine.</w:t>
@@ -5846,106 +5827,222 @@
     </w:p>
     <w:p>
       <w:pPr>
-        <w:spacing w:before="80" w:after="120" w:line="252" w:lineRule="auto"/>
+        <w:keepNext/>
+        <w:spacing w:before="160" w:after="40"/>
+        <w:jc w:val="center"/>
       </w:pPr>
       <w:r>
-        <w:rPr>
-          <w:rFonts w:ascii="Consolas" w:hAnsi="Consolas"/>
-          <w:color w:val="0F172A"/>
-          <w:sz w:val="17"/>
-        </w:rPr>
-        <w:t>PLOT 1: RECURSIVE TRAVERSAL LATENCY (ms) VS. PATH DEPTH (1 TO 5 HOPS)</w:t>
-        <w:br/>
-        <w:t>Latency</w:t>
-        <w:br/>
-        <w:t xml:space="preserve"> (ms)</w:t>
-        <w:br/>
-        <w:t>1200 |                                                         [PostgreSQL: 1140 ms]</w:t>
-        <w:br/>
-        <w:t xml:space="preserve"> 800 |                                                              *</w:t>
-        <w:br/>
-        <w:t xml:space="preserve"> 400 |                                            *                 *</w:t>
-        <w:br/>
-        <w:t xml:space="preserve"> 300 |                              [MongoDB: 312 ms]               |</w:t>
-        <w:br/>
-        <w:t xml:space="preserve"> 200 |                                     *                        |</w:t>
-        <w:br/>
-        <w:t xml:space="preserve"> 100 |                        *            |                        |</w:t>
-        <w:br/>
-        <w:t xml:space="preserve">  50 |          *             |            |                        |</w:t>
-        <w:br/>
-        <w:t xml:space="preserve">   0 +----------+-------------+------------+------------------------+-----&gt;</w:t>
-        <w:br/>
-        <w:t xml:space="preserve">       1-Hop        2-Hops       3-Hops       4-Hops        5-Hops (Depth)</w:t>
-        <w:br/>
-        <w:t xml:space="preserve"> [o] Neo4j Index-Free Adjacency: 1.8ms -&gt; 2.6ms -&gt; 4.2ms -&gt; 7.1ms -&gt; 11.5ms  (Near-Flat Linear Scaling!)</w:t>
-        <w:br/>
-        <w:t xml:space="preserve"> [*] MongoDB $graphLookup:      4.6ms -&gt; 16.2ms -&gt; 48.6ms -&gt; 128.4ms -&gt; 312.0ms (Exponential Growth)</w:t>
-        <w:br/>
+        <w:drawing>
+          <wp:inline xmlns:a="http://schemas.openxmlformats.org/drawingml/2006/main" xmlns:pic="http://schemas.openxmlformats.org/drawingml/2006/picture">
+            <wp:extent cx="5303520" cy="3397567"/>
+            <wp:docPr id="2" name="Picture 2"/>
+            <wp:cNvGraphicFramePr>
+              <a:graphicFrameLocks noChangeAspect="1"/>
+            </wp:cNvGraphicFramePr>
+            <a:graphic>
+              <a:graphicData uri="http://schemas.openxmlformats.org/drawingml/2006/picture">
+                <pic:pic>
+                  <pic:nvPicPr>
+                    <pic:cNvPr id="0" name="fig2_graph_traversal_scaling.png"/>
+                    <pic:cNvPicPr/>
+                  </pic:nvPicPr>
+                  <pic:blipFill>
+                    <a:blip r:embed="rId10"/>
+                    <a:stretch>
+                      <a:fillRect/>
+                    </a:stretch>
+                  </pic:blipFill>
+                  <pic:spPr>
+                    <a:xfrm>
+                      <a:off x="0" y="0"/>
+                      <a:ext cx="5303520" cy="3397567"/>
+                    </a:xfrm>
+                    <a:prstGeom prst="rect"/>
+                  </pic:spPr>
+                </pic:pic>
+              </a:graphicData>
+            </a:graphic>
+          </wp:inline>
+        </w:drawing>
       </w:r>
     </w:p>
     <w:p>
       <w:pPr>
-        <w:spacing w:before="0" w:after="160" w:line="276" w:lineRule="auto"/>
+        <w:spacing w:before="40" w:after="160"/>
         <w:jc w:val="center"/>
       </w:pPr>
       <w:r>
         <w:rPr>
           <w:rFonts w:ascii="Times New Roman" w:hAnsi="Times New Roman"/>
-          <w:b w:val="0"/>
           <w:i/>
-          <w:color w:val="000000"/>
           <w:sz w:val="17"/>
         </w:rPr>
-        <w:t>Fig. 2: Traversal latency comparison demonstrating Neo4j index-free adjacency scalability over MongoDB recursive aggregation.</w:t>
+        <w:t>Fig. 2: Recursive traversal latency scaling (ms) vs. path depth (1 to 5 hops) demonstrating Neo4j index-free adjacency scalability over MongoDB recursive aggregation and PostgreSQL recursive joins.</w:t>
       </w:r>
     </w:p>
     <w:p>
       <w:pPr>
-        <w:spacing w:before="80" w:after="120" w:line="252" w:lineRule="auto"/>
+        <w:keepNext/>
+        <w:spacing w:before="160" w:after="40"/>
+        <w:jc w:val="center"/>
       </w:pPr>
       <w:r>
-        <w:rPr>
-          <w:rFonts w:ascii="Consolas" w:hAnsi="Consolas"/>
-          <w:color w:val="0F172A"/>
-          <w:sz w:val="17"/>
-        </w:rPr>
-        <w:t>PLOT 2: EBBINGHAUS COGNITIVE MEMORY DECAY D(n) VS. INACTIVE DAYS ELAPSED (lambda = 0.1)</w:t>
-        <w:br/>
-        <w:t>Decay D(n)</w:t>
-        <w:br/>
-        <w:t xml:space="preserve"> 1.00 |                                           =================== (Asymptotic Limit = 1.00)</w:t>
-        <w:br/>
-        <w:t xml:space="preserve"> 0.90 |                             . - ~ ~ ~ *  [Day 23: D(n) = 0.90 - Critically Decayed]</w:t>
-        <w:br/>
-        <w:t xml:space="preserve"> 0.75 |                     . - ~ *</w:t>
-        <w:br/>
-        <w:t xml:space="preserve"> 0.50 |             . - ~ *  [Day 7: D(n) = 0.50 - Half-Forgotten]</w:t>
-        <w:br/>
-        <w:t xml:space="preserve"> 0.25 |      . - ~ *</w:t>
-        <w:br/>
-        <w:t xml:space="preserve"> 0.00 |----+--------+--------+--------+--------+--------+--------+--------+-----&gt; Days</w:t>
-        <w:br/>
-        <w:t xml:space="preserve">      0    3        7       12       18       23       30       40       50</w:t>
-        <w:br/>
-        <w:t xml:space="preserve"> Formula: D(n) = 1 - exp(-0.1 * delta_t). Notes with high decay are boosted into the active recommendation feed.</w:t>
-        <w:br/>
+        <w:drawing>
+          <wp:inline xmlns:a="http://schemas.openxmlformats.org/drawingml/2006/main" xmlns:pic="http://schemas.openxmlformats.org/drawingml/2006/picture">
+            <wp:extent cx="5303520" cy="3231832"/>
+            <wp:docPr id="3" name="Picture 3"/>
+            <wp:cNvGraphicFramePr>
+              <a:graphicFrameLocks noChangeAspect="1"/>
+            </wp:cNvGraphicFramePr>
+            <a:graphic>
+              <a:graphicData uri="http://schemas.openxmlformats.org/drawingml/2006/picture">
+                <pic:pic>
+                  <pic:nvPicPr>
+                    <pic:cNvPr id="0" name="fig3_ebbinghaus_decay_curve.png"/>
+                    <pic:cNvPicPr/>
+                  </pic:nvPicPr>
+                  <pic:blipFill>
+                    <a:blip r:embed="rId11"/>
+                    <a:stretch>
+                      <a:fillRect/>
+                    </a:stretch>
+                  </pic:blipFill>
+                  <pic:spPr>
+                    <a:xfrm>
+                      <a:off x="0" y="0"/>
+                      <a:ext cx="5303520" cy="3231832"/>
+                    </a:xfrm>
+                    <a:prstGeom prst="rect"/>
+                  </pic:spPr>
+                </pic:pic>
+              </a:graphicData>
+            </a:graphic>
+          </wp:inline>
+        </w:drawing>
       </w:r>
     </w:p>
     <w:p>
       <w:pPr>
-        <w:spacing w:before="0" w:after="160" w:line="276" w:lineRule="auto"/>
+        <w:spacing w:before="40" w:after="160"/>
         <w:jc w:val="center"/>
       </w:pPr>
       <w:r>
         <w:rPr>
           <w:rFonts w:ascii="Times New Roman" w:hAnsi="Times New Roman"/>
-          <w:b w:val="0"/>
           <w:i/>
-          <w:color w:val="000000"/>
           <w:sz w:val="17"/>
         </w:rPr>
-        <w:t>Fig. 3: Exponential cognitive memory decay curve governing spaced repetition prioritization in the hybrid recommender.</w:t>
+        <w:t>Fig. 3: Exponential cognitive memory decay curve governing spaced repetition prioritization in the hybrid recommender (lambda = 0.1).</w:t>
+      </w:r>
+    </w:p>
+    <w:p>
+      <w:pPr>
+        <w:keepNext/>
+        <w:spacing w:before="160" w:after="40"/>
+        <w:jc w:val="center"/>
+      </w:pPr>
+      <w:r>
+        <w:drawing>
+          <wp:inline xmlns:a="http://schemas.openxmlformats.org/drawingml/2006/main" xmlns:pic="http://schemas.openxmlformats.org/drawingml/2006/picture">
+            <wp:extent cx="5303520" cy="3216889"/>
+            <wp:docPr id="4" name="Picture 4"/>
+            <wp:cNvGraphicFramePr>
+              <a:graphicFrameLocks noChangeAspect="1"/>
+            </wp:cNvGraphicFramePr>
+            <a:graphic>
+              <a:graphicData uri="http://schemas.openxmlformats.org/drawingml/2006/picture">
+                <pic:pic>
+                  <pic:nvPicPr>
+                    <pic:cNvPr id="0" name="fig4_cache_latency_percentiles.png"/>
+                    <pic:cNvPicPr/>
+                  </pic:nvPicPr>
+                  <pic:blipFill>
+                    <a:blip r:embed="rId12"/>
+                    <a:stretch>
+                      <a:fillRect/>
+                    </a:stretch>
+                  </pic:blipFill>
+                  <pic:spPr>
+                    <a:xfrm>
+                      <a:off x="0" y="0"/>
+                      <a:ext cx="5303520" cy="3216889"/>
+                    </a:xfrm>
+                    <a:prstGeom prst="rect"/>
+                  </pic:spPr>
+                </pic:pic>
+              </a:graphicData>
+            </a:graphic>
+          </wp:inline>
+        </w:drawing>
+      </w:r>
+    </w:p>
+    <w:p>
+      <w:pPr>
+        <w:spacing w:before="40" w:after="160"/>
+        <w:jc w:val="center"/>
+      </w:pPr>
+      <w:r>
+        <w:rPr>
+          <w:rFonts w:ascii="Times New Roman" w:hAnsi="Times New Roman"/>
+          <w:i/>
+          <w:sz w:val="17"/>
+        </w:rPr>
+        <w:t>Fig. 4: Study path retrieval response latency percentiles (P50, P95, P99) comparing uncached multi-database queries vs. Redis in-memory cache (98.6% drop in P99 latency).</w:t>
+      </w:r>
+    </w:p>
+    <w:p>
+      <w:pPr>
+        <w:keepNext/>
+        <w:spacing w:before="160" w:after="40"/>
+        <w:jc w:val="center"/>
+      </w:pPr>
+      <w:r>
+        <w:drawing>
+          <wp:inline xmlns:a="http://schemas.openxmlformats.org/drawingml/2006/main" xmlns:pic="http://schemas.openxmlformats.org/drawingml/2006/picture">
+            <wp:extent cx="5303520" cy="3231832"/>
+            <wp:docPr id="5" name="Picture 5"/>
+            <wp:cNvGraphicFramePr>
+              <a:graphicFrameLocks noChangeAspect="1"/>
+            </wp:cNvGraphicFramePr>
+            <a:graphic>
+              <a:graphicData uri="http://schemas.openxmlformats.org/drawingml/2006/picture">
+                <pic:pic>
+                  <pic:nvPicPr>
+                    <pic:cNvPr id="0" name="fig5_search_ir_metrics.png"/>
+                    <pic:cNvPicPr/>
+                  </pic:nvPicPr>
+                  <pic:blipFill>
+                    <a:blip r:embed="rId13"/>
+                    <a:stretch>
+                      <a:fillRect/>
+                    </a:stretch>
+                  </pic:blipFill>
+                  <pic:spPr>
+                    <a:xfrm>
+                      <a:off x="0" y="0"/>
+                      <a:ext cx="5303520" cy="3231832"/>
+                    </a:xfrm>
+                    <a:prstGeom prst="rect"/>
+                  </pic:spPr>
+                </pic:pic>
+              </a:graphicData>
+            </a:graphic>
+          </wp:inline>
+        </w:drawing>
+      </w:r>
+    </w:p>
+    <w:p>
+      <w:pPr>
+        <w:spacing w:before="40" w:after="160"/>
+        <w:jc w:val="center"/>
+      </w:pPr>
+      <w:r>
+        <w:rPr>
+          <w:rFonts w:ascii="Times New Roman" w:hAnsi="Times New Roman"/>
+          <w:i/>
+          <w:sz w:val="17"/>
+        </w:rPr>
+        <w:t>Fig. 5: Information retrieval search relevance benchmark (Precision@5, Recall@10, MRR@10, NDCG@10) across MongoDB Regex, Elasticsearch BM25, and Hybrid Polyglot search.</w:t>
       </w:r>
     </w:p>
     <w:p>

</xml_diff>

<commit_message>
docs: embed 300 DPI architecture diagram and benchmark charts into report docx
</commit_message>
<xml_diff>
--- a/Digital_Assignment3_Implementation_Report.docx
+++ b/Digital_Assignment3_Implementation_Report.docx
@@ -2355,73 +2355,54 @@
     </w:p>
     <w:p>
       <w:pPr>
-        <w:spacing w:before="80" w:after="120" w:line="252" w:lineRule="auto"/>
+        <w:keepNext/>
+        <w:spacing w:before="160" w:after="40"/>
+        <w:jc w:val="center"/>
       </w:pPr>
       <w:r>
-        <w:rPr>
-          <w:rFonts w:ascii="Consolas" w:hAnsi="Consolas"/>
-          <w:color w:val="0F172A"/>
-          <w:sz w:val="17"/>
-        </w:rPr>
-        <w:t>+------------------------------------------------------------------------------------------------------+</w:t>
-        <w:br/>
-        <w:t>|                                     PRESENTATION LAYER (Next.js 16)                                  |</w:t>
-        <w:br/>
-        <w:t>|  [Unified Knowledge Feed]  [PDF Viewer &amp; Chunks]  [Study Path Stepper]  [Interactive 2D Concept Graph] |</w:t>
-        <w:br/>
-        <w:t>+---------------------------------------------------+--------------------------------------------------+</w:t>
-        <w:br/>
-        <w:t xml:space="preserve">                                                    | RESTful JSON (HTTP / Port 8000)</w:t>
-        <w:br/>
-        <w:t>+---------------------------------------------------v--------------------------------------------------+</w:t>
-        <w:br/>
-        <w:t>|                                       API GATEWAY LAYER (FastAPI)                                    |</w:t>
-        <w:br/>
-        <w:t>|  - JWT Bearer &amp; PBKDF2 Auth        - 400-Word Sliding-Window Chunker     - Cycle-Safe Topological Sort|</w:t>
-        <w:br/>
-        <w:t>|  - Multi-Tenant Namespace Guard    - Gemini 2.5 Flash Extraction Engine  - Worker Lease Crash Recovery|</w:t>
-        <w:br/>
-        <w:t>+--------------------+----------------------+-----------------------+----------------------------------+</w:t>
-        <w:br/>
-        <w:t xml:space="preserve">                     |                      |                       |                                  </w:t>
-        <w:br/>
-        <w:t xml:space="preserve">        (Document Truth)      (Graph Traversal)       (Full-Text Index)       (Ephemeral State)        </w:t>
-        <w:br/>
-        <w:t xml:space="preserve">                     |                      |                       |                                  </w:t>
-        <w:br/>
-        <w:t>+--------------------v--+ +-----------------v---+ +-----------------v---+ +----------------------------v--+</w:t>
-        <w:br/>
-        <w:t>|       MONGODB         | |       NEO4J         | |   ELASTICSEARCH     | |           REDIS                |</w:t>
-        <w:br/>
-        <w:t>|     Port: 27017       | |   Port: 7687/7474   | |    Port: 9200       | |        Port: 6379              |</w:t>
-        <w:br/>
-        <w:t>| - users               | | Nodes:              | | Index:              | | Key Prefixes:                  |</w:t>
-        <w:br/>
-        <w:t>| - notes               | |  (:SP_Concept)      | |  studypath_notes    | |  sp:path:{u}:{c} (TTL 1800s)   |</w:t>
-        <w:br/>
-        <w:t>| - documents           | |  (:SP_Document)     | |  studypath_documents| |  sp:tb:gemini (Token Bucket)   |</w:t>
-        <w:br/>
-        <w:t>| - chunks (word bounds)| | Edges:              | | - BM25 Scoring      | |  sp:worker:lease (TTL 120s)    |</w:t>
-        <w:br/>
-        <w:t>| - user_known_concepts | |  [:PREREQUISITE_OF] | | - Fuzzy Typo Match  | |  user:{u}:recommendations      |</w:t>
-        <w:br/>
-        <w:t>| - knowledge_metrics   | |  [:MENTIONS]        | | - Trigram N-grams   | |  note:{id} (Entity Cache)      |</w:t>
-        <w:br/>
-        <w:t>+-----------------------+ +---------------------+ +---------------------+ +--------------------------------+</w:t>
-        <w:br/>
+        <w:drawing>
+          <wp:inline xmlns:a="http://schemas.openxmlformats.org/drawingml/2006/main" xmlns:pic="http://schemas.openxmlformats.org/drawingml/2006/picture">
+            <wp:extent cx="5943600" cy="3842327"/>
+            <wp:docPr id="1" name="Picture 1"/>
+            <wp:cNvGraphicFramePr>
+              <a:graphicFrameLocks noChangeAspect="1"/>
+            </wp:cNvGraphicFramePr>
+            <a:graphic>
+              <a:graphicData uri="http://schemas.openxmlformats.org/drawingml/2006/picture">
+                <pic:pic>
+                  <pic:nvPicPr>
+                    <pic:cNvPr id="0" name="fig1_system_architecture.png"/>
+                    <pic:cNvPicPr/>
+                  </pic:nvPicPr>
+                  <pic:blipFill>
+                    <a:blip r:embed="rId9"/>
+                    <a:stretch>
+                      <a:fillRect/>
+                    </a:stretch>
+                  </pic:blipFill>
+                  <pic:spPr>
+                    <a:xfrm>
+                      <a:off x="0" y="0"/>
+                      <a:ext cx="5943600" cy="3842327"/>
+                    </a:xfrm>
+                    <a:prstGeom prst="rect"/>
+                  </pic:spPr>
+                </pic:pic>
+              </a:graphicData>
+            </a:graphic>
+          </wp:inline>
+        </w:drawing>
       </w:r>
     </w:p>
     <w:p>
       <w:pPr>
-        <w:spacing w:before="0" w:after="160" w:line="276" w:lineRule="auto"/>
+        <w:spacing w:before="40" w:after="160"/>
         <w:jc w:val="center"/>
       </w:pPr>
       <w:r>
         <w:rPr>
           <w:rFonts w:ascii="Times New Roman" w:hAnsi="Times New Roman"/>
-          <w:b w:val="0"/>
           <w:i/>
-          <w:color w:val="000000"/>
           <w:sz w:val="17"/>
         </w:rPr>
         <w:t>Fig. 1: Polyglot Persistence Architecture of the Smart Notes+ Study Path Engine.</w:t>
@@ -5846,106 +5827,222 @@
     </w:p>
     <w:p>
       <w:pPr>
-        <w:spacing w:before="80" w:after="120" w:line="252" w:lineRule="auto"/>
+        <w:keepNext/>
+        <w:spacing w:before="160" w:after="40"/>
+        <w:jc w:val="center"/>
       </w:pPr>
       <w:r>
-        <w:rPr>
-          <w:rFonts w:ascii="Consolas" w:hAnsi="Consolas"/>
-          <w:color w:val="0F172A"/>
-          <w:sz w:val="17"/>
-        </w:rPr>
-        <w:t>PLOT 1: RECURSIVE TRAVERSAL LATENCY (ms) VS. PATH DEPTH (1 TO 5 HOPS)</w:t>
-        <w:br/>
-        <w:t>Latency</w:t>
-        <w:br/>
-        <w:t xml:space="preserve"> (ms)</w:t>
-        <w:br/>
-        <w:t>1200 |                                                         [PostgreSQL: 1140 ms]</w:t>
-        <w:br/>
-        <w:t xml:space="preserve"> 800 |                                                              *</w:t>
-        <w:br/>
-        <w:t xml:space="preserve"> 400 |                                            *                 *</w:t>
-        <w:br/>
-        <w:t xml:space="preserve"> 300 |                              [MongoDB: 312 ms]               |</w:t>
-        <w:br/>
-        <w:t xml:space="preserve"> 200 |                                     *                        |</w:t>
-        <w:br/>
-        <w:t xml:space="preserve"> 100 |                        *            |                        |</w:t>
-        <w:br/>
-        <w:t xml:space="preserve">  50 |          *             |            |                        |</w:t>
-        <w:br/>
-        <w:t xml:space="preserve">   0 +----------+-------------+------------+------------------------+-----&gt;</w:t>
-        <w:br/>
-        <w:t xml:space="preserve">       1-Hop        2-Hops       3-Hops       4-Hops        5-Hops (Depth)</w:t>
-        <w:br/>
-        <w:t xml:space="preserve"> [o] Neo4j Index-Free Adjacency: 1.8ms -&gt; 2.6ms -&gt; 4.2ms -&gt; 7.1ms -&gt; 11.5ms  (Near-Flat Linear Scaling!)</w:t>
-        <w:br/>
-        <w:t xml:space="preserve"> [*] MongoDB $graphLookup:      4.6ms -&gt; 16.2ms -&gt; 48.6ms -&gt; 128.4ms -&gt; 312.0ms (Exponential Growth)</w:t>
-        <w:br/>
+        <w:drawing>
+          <wp:inline xmlns:a="http://schemas.openxmlformats.org/drawingml/2006/main" xmlns:pic="http://schemas.openxmlformats.org/drawingml/2006/picture">
+            <wp:extent cx="5303520" cy="3397567"/>
+            <wp:docPr id="2" name="Picture 2"/>
+            <wp:cNvGraphicFramePr>
+              <a:graphicFrameLocks noChangeAspect="1"/>
+            </wp:cNvGraphicFramePr>
+            <a:graphic>
+              <a:graphicData uri="http://schemas.openxmlformats.org/drawingml/2006/picture">
+                <pic:pic>
+                  <pic:nvPicPr>
+                    <pic:cNvPr id="0" name="fig2_graph_traversal_scaling.png"/>
+                    <pic:cNvPicPr/>
+                  </pic:nvPicPr>
+                  <pic:blipFill>
+                    <a:blip r:embed="rId10"/>
+                    <a:stretch>
+                      <a:fillRect/>
+                    </a:stretch>
+                  </pic:blipFill>
+                  <pic:spPr>
+                    <a:xfrm>
+                      <a:off x="0" y="0"/>
+                      <a:ext cx="5303520" cy="3397567"/>
+                    </a:xfrm>
+                    <a:prstGeom prst="rect"/>
+                  </pic:spPr>
+                </pic:pic>
+              </a:graphicData>
+            </a:graphic>
+          </wp:inline>
+        </w:drawing>
       </w:r>
     </w:p>
     <w:p>
       <w:pPr>
-        <w:spacing w:before="0" w:after="160" w:line="276" w:lineRule="auto"/>
+        <w:spacing w:before="40" w:after="160"/>
         <w:jc w:val="center"/>
       </w:pPr>
       <w:r>
         <w:rPr>
           <w:rFonts w:ascii="Times New Roman" w:hAnsi="Times New Roman"/>
-          <w:b w:val="0"/>
           <w:i/>
-          <w:color w:val="000000"/>
           <w:sz w:val="17"/>
         </w:rPr>
-        <w:t>Fig. 2: Traversal latency comparison demonstrating Neo4j index-free adjacency scalability over MongoDB recursive aggregation.</w:t>
+        <w:t>Fig. 2: Recursive traversal latency scaling (ms) vs. path depth (1 to 5 hops) demonstrating Neo4j index-free adjacency scalability over MongoDB recursive aggregation and PostgreSQL recursive joins.</w:t>
       </w:r>
     </w:p>
     <w:p>
       <w:pPr>
-        <w:spacing w:before="80" w:after="120" w:line="252" w:lineRule="auto"/>
+        <w:keepNext/>
+        <w:spacing w:before="160" w:after="40"/>
+        <w:jc w:val="center"/>
       </w:pPr>
       <w:r>
-        <w:rPr>
-          <w:rFonts w:ascii="Consolas" w:hAnsi="Consolas"/>
-          <w:color w:val="0F172A"/>
-          <w:sz w:val="17"/>
-        </w:rPr>
-        <w:t>PLOT 2: EBBINGHAUS COGNITIVE MEMORY DECAY D(n) VS. INACTIVE DAYS ELAPSED (lambda = 0.1)</w:t>
-        <w:br/>
-        <w:t>Decay D(n)</w:t>
-        <w:br/>
-        <w:t xml:space="preserve"> 1.00 |                                           =================== (Asymptotic Limit = 1.00)</w:t>
-        <w:br/>
-        <w:t xml:space="preserve"> 0.90 |                             . - ~ ~ ~ *  [Day 23: D(n) = 0.90 - Critically Decayed]</w:t>
-        <w:br/>
-        <w:t xml:space="preserve"> 0.75 |                     . - ~ *</w:t>
-        <w:br/>
-        <w:t xml:space="preserve"> 0.50 |             . - ~ *  [Day 7: D(n) = 0.50 - Half-Forgotten]</w:t>
-        <w:br/>
-        <w:t xml:space="preserve"> 0.25 |      . - ~ *</w:t>
-        <w:br/>
-        <w:t xml:space="preserve"> 0.00 |----+--------+--------+--------+--------+--------+--------+--------+-----&gt; Days</w:t>
-        <w:br/>
-        <w:t xml:space="preserve">      0    3        7       12       18       23       30       40       50</w:t>
-        <w:br/>
-        <w:t xml:space="preserve"> Formula: D(n) = 1 - exp(-0.1 * delta_t). Notes with high decay are boosted into the active recommendation feed.</w:t>
-        <w:br/>
+        <w:drawing>
+          <wp:inline xmlns:a="http://schemas.openxmlformats.org/drawingml/2006/main" xmlns:pic="http://schemas.openxmlformats.org/drawingml/2006/picture">
+            <wp:extent cx="5303520" cy="3231832"/>
+            <wp:docPr id="3" name="Picture 3"/>
+            <wp:cNvGraphicFramePr>
+              <a:graphicFrameLocks noChangeAspect="1"/>
+            </wp:cNvGraphicFramePr>
+            <a:graphic>
+              <a:graphicData uri="http://schemas.openxmlformats.org/drawingml/2006/picture">
+                <pic:pic>
+                  <pic:nvPicPr>
+                    <pic:cNvPr id="0" name="fig3_ebbinghaus_decay_curve.png"/>
+                    <pic:cNvPicPr/>
+                  </pic:nvPicPr>
+                  <pic:blipFill>
+                    <a:blip r:embed="rId11"/>
+                    <a:stretch>
+                      <a:fillRect/>
+                    </a:stretch>
+                  </pic:blipFill>
+                  <pic:spPr>
+                    <a:xfrm>
+                      <a:off x="0" y="0"/>
+                      <a:ext cx="5303520" cy="3231832"/>
+                    </a:xfrm>
+                    <a:prstGeom prst="rect"/>
+                  </pic:spPr>
+                </pic:pic>
+              </a:graphicData>
+            </a:graphic>
+          </wp:inline>
+        </w:drawing>
       </w:r>
     </w:p>
     <w:p>
       <w:pPr>
-        <w:spacing w:before="0" w:after="160" w:line="276" w:lineRule="auto"/>
+        <w:spacing w:before="40" w:after="160"/>
         <w:jc w:val="center"/>
       </w:pPr>
       <w:r>
         <w:rPr>
           <w:rFonts w:ascii="Times New Roman" w:hAnsi="Times New Roman"/>
-          <w:b w:val="0"/>
           <w:i/>
-          <w:color w:val="000000"/>
           <w:sz w:val="17"/>
         </w:rPr>
-        <w:t>Fig. 3: Exponential cognitive memory decay curve governing spaced repetition prioritization in the hybrid recommender.</w:t>
+        <w:t>Fig. 3: Exponential cognitive memory decay curve governing spaced repetition prioritization in the hybrid recommender (lambda = 0.1).</w:t>
+      </w:r>
+    </w:p>
+    <w:p>
+      <w:pPr>
+        <w:keepNext/>
+        <w:spacing w:before="160" w:after="40"/>
+        <w:jc w:val="center"/>
+      </w:pPr>
+      <w:r>
+        <w:drawing>
+          <wp:inline xmlns:a="http://schemas.openxmlformats.org/drawingml/2006/main" xmlns:pic="http://schemas.openxmlformats.org/drawingml/2006/picture">
+            <wp:extent cx="5303520" cy="3216889"/>
+            <wp:docPr id="4" name="Picture 4"/>
+            <wp:cNvGraphicFramePr>
+              <a:graphicFrameLocks noChangeAspect="1"/>
+            </wp:cNvGraphicFramePr>
+            <a:graphic>
+              <a:graphicData uri="http://schemas.openxmlformats.org/drawingml/2006/picture">
+                <pic:pic>
+                  <pic:nvPicPr>
+                    <pic:cNvPr id="0" name="fig4_cache_latency_percentiles.png"/>
+                    <pic:cNvPicPr/>
+                  </pic:nvPicPr>
+                  <pic:blipFill>
+                    <a:blip r:embed="rId12"/>
+                    <a:stretch>
+                      <a:fillRect/>
+                    </a:stretch>
+                  </pic:blipFill>
+                  <pic:spPr>
+                    <a:xfrm>
+                      <a:off x="0" y="0"/>
+                      <a:ext cx="5303520" cy="3216889"/>
+                    </a:xfrm>
+                    <a:prstGeom prst="rect"/>
+                  </pic:spPr>
+                </pic:pic>
+              </a:graphicData>
+            </a:graphic>
+          </wp:inline>
+        </w:drawing>
+      </w:r>
+    </w:p>
+    <w:p>
+      <w:pPr>
+        <w:spacing w:before="40" w:after="160"/>
+        <w:jc w:val="center"/>
+      </w:pPr>
+      <w:r>
+        <w:rPr>
+          <w:rFonts w:ascii="Times New Roman" w:hAnsi="Times New Roman"/>
+          <w:i/>
+          <w:sz w:val="17"/>
+        </w:rPr>
+        <w:t>Fig. 4: Study path retrieval response latency percentiles (P50, P95, P99) comparing uncached multi-database queries vs. Redis in-memory cache (98.6% drop in P99 latency).</w:t>
+      </w:r>
+    </w:p>
+    <w:p>
+      <w:pPr>
+        <w:keepNext/>
+        <w:spacing w:before="160" w:after="40"/>
+        <w:jc w:val="center"/>
+      </w:pPr>
+      <w:r>
+        <w:drawing>
+          <wp:inline xmlns:a="http://schemas.openxmlformats.org/drawingml/2006/main" xmlns:pic="http://schemas.openxmlformats.org/drawingml/2006/picture">
+            <wp:extent cx="5303520" cy="3231832"/>
+            <wp:docPr id="5" name="Picture 5"/>
+            <wp:cNvGraphicFramePr>
+              <a:graphicFrameLocks noChangeAspect="1"/>
+            </wp:cNvGraphicFramePr>
+            <a:graphic>
+              <a:graphicData uri="http://schemas.openxmlformats.org/drawingml/2006/picture">
+                <pic:pic>
+                  <pic:nvPicPr>
+                    <pic:cNvPr id="0" name="fig5_search_ir_metrics.png"/>
+                    <pic:cNvPicPr/>
+                  </pic:nvPicPr>
+                  <pic:blipFill>
+                    <a:blip r:embed="rId13"/>
+                    <a:stretch>
+                      <a:fillRect/>
+                    </a:stretch>
+                  </pic:blipFill>
+                  <pic:spPr>
+                    <a:xfrm>
+                      <a:off x="0" y="0"/>
+                      <a:ext cx="5303520" cy="3231832"/>
+                    </a:xfrm>
+                    <a:prstGeom prst="rect"/>
+                  </pic:spPr>
+                </pic:pic>
+              </a:graphicData>
+            </a:graphic>
+          </wp:inline>
+        </w:drawing>
+      </w:r>
+    </w:p>
+    <w:p>
+      <w:pPr>
+        <w:spacing w:before="40" w:after="160"/>
+        <w:jc w:val="center"/>
+      </w:pPr>
+      <w:r>
+        <w:rPr>
+          <w:rFonts w:ascii="Times New Roman" w:hAnsi="Times New Roman"/>
+          <w:i/>
+          <w:sz w:val="17"/>
+        </w:rPr>
+        <w:t>Fig. 5: Information retrieval search relevance benchmark (Precision@5, Recall@10, MRR@10, NDCG@10) across MongoDB Regex, Elasticsearch BM25, and Hybrid Polyglot search.</w:t>
       </w:r>
     </w:p>
     <w:p>

</xml_diff>